<commit_message>
Diagnose the Student-t sampler, sync README to v2 results, finalise title page
</commit_message>
<xml_diff>
--- a/docs/Sampling_Project_Report.docx
+++ b/docs/Sampling_Project_Report.docx
@@ -76,7 +76,7 @@
           <w:i w:val="0"/>
           <w:sz w:val="22"/>
         </w:rPr>
-        <w:t>Institution: [INSTITUTION - to be completed]</w:t>
+        <w:t>Institution: __________________________</w:t>
       </w:r>
     </w:p>
     <w:p>
@@ -91,7 +91,7 @@
           <w:i w:val="0"/>
           <w:sz w:val="22"/>
         </w:rPr>
-        <w:t>Course: [COURSE NUMBER - to be completed]</w:t>
+        <w:t>Course: Advanced Methods in Machine Learning</w:t>
       </w:r>
     </w:p>
     <w:p>
@@ -106,7 +106,7 @@
           <w:i w:val="0"/>
           <w:sz w:val="22"/>
         </w:rPr>
-        <w:t>Lecturer: [LECTURER - to be completed]</w:t>
+        <w:t>Lecturer: Dr. Boaz Tamir</w:t>
       </w:r>
     </w:p>
     <w:p>
@@ -121,7 +121,7 @@
           <w:i w:val="0"/>
           <w:sz w:val="22"/>
         </w:rPr>
-        <w:t>Student IDs: [STUDENT ID NUMBERS - to be completed]</w:t>
+        <w:t>Student IDs: __________________________</w:t>
       </w:r>
     </w:p>
     <w:p>
@@ -177,7 +177,7 @@
           <w:i w:val="0"/>
           <w:sz w:val="22"/>
         </w:rPr>
-        <w:t>Markov chain Monte Carlo (MCMC) makes Bayesian inference possible when the posterior has no closed form, but its reliability rests on diagnostics that are easy to misread. This study compares five samplers, all implemented from scratch, on Bayesian linear regression for forecasting virtual-machine CPU utilisation 5 minutes ahead, using the Bitbrains GWA-T-12 datacenter traces [1]. The samplers are random-walk Metropolis-Hastings, adaptive Metropolis, Fisher-preconditioned Metropolis, Gibbs sampling and Hamiltonian Monte Carlo. Observations are split chronologically, with an embargo preventing feature windows from crossing split boundaries and all scaling estimated on training data alone. Convergence is assessed with rank-normalised and folded R-hat and with bulk and tail effective sample size (ESS), computed jointly across 4 dispersed chains [2]. Gibbs, Hamiltonian Monte Carlo and preconditioned Metropolis converge. Plain random-walk Metropolis and adaptive Metropolis do not, reaching R-hat 4.40 and 3.35, with posterior means wrong by 1.36 and 1.44 against a deterministic quadrature reference. The cause is posterior anisotropy, condition number 314. Preconditioning with the observed Fisher information raises bulk ESS from 4 to 627, and the converged samplers reproduce the quadrature reference to within 0.0025. Test residuals have an excess kurtosis of 111, so a Gaussian likelihood yields posterior predictive intervals that are far too wide, nominal 50% intervals covering 94.7%. A Student-t likelihood, with degrees of freedom selected on validation data, reduces this to 74.6% and cuts the median absolute error from 0.210 to 0.072 CPU percentage points, but the intervals remain substantially miscalibrated.</w:t>
+        <w:t>Markov chain Monte Carlo (MCMC) makes Bayesian inference possible when the posterior has no closed form, but its reliability rests on diagnostics that are easy to misread. This study compares five samplers, all implemented from scratch, on Bayesian linear regression for forecasting virtual-machine CPU utilisation 5 minutes ahead, using the Bitbrains GWA-T-12 datacenter traces [1]. The samplers are random-walk Metropolis-Hastings, adaptive Metropolis, Fisher-preconditioned Metropolis, Gibbs sampling and Hamiltonian Monte Carlo. Observations are split chronologically, with an embargo preventing feature windows from crossing split boundaries and all scaling estimated on training data alone. Convergence is assessed with rank-normalised and folded R-hat and with bulk and tail effective sample size (ESS), computed jointly across 4 dispersed chains [2]. Gibbs, Hamiltonian Monte Carlo and preconditioned Metropolis converge. Plain random-walk Metropolis and adaptive Metropolis do not, reaching R-hat 4.40 and 3.35, with posterior means wrong by 1.36 and 1.44 against a deterministic quadrature reference. The cause is posterior anisotropy, condition number 314. Preconditioning with the observed Fisher information raises bulk ESS from 4 to 627, and the converged samplers reproduce the quadrature reference to within 0.0025. Test residuals have an excess kurtosis of 111, so a Gaussian likelihood yields posterior predictive intervals that are far too wide, nominal 50% intervals covering 94.7%. A Student-t likelihood, with degrees of freedom selected on validation data, reduces this to 74.1% and cuts the median absolute error from 0.210 to 0.072 CPU percentage points, but the intervals remain substantially miscalibrated.</w:t>
       </w:r>
     </w:p>
     <w:p>
@@ -196,24 +196,10 @@
     </w:p>
     <w:p>
       <w:r>
-        <w:fldChar w:fldCharType="begin"/>
+        <w:fldChar w:fldCharType="begin" w:dirty="true"/>
         <w:instrText xml:space="preserve"> TOC \o "1-3" \h \z \u </w:instrText>
         <w:fldChar w:fldCharType="separate"/>
         <w:fldChar w:fldCharType="end"/>
-      </w:r>
-    </w:p>
-    <w:p>
-      <w:pPr>
-        <w:keepNext w:val="0"/>
-        <w:spacing w:after="120"/>
-      </w:pPr>
-      <w:r>
-        <w:rPr>
-          <w:b w:val="0"/>
-          <w:i/>
-          <w:sz w:val="18"/>
-        </w:rPr>
-        <w:t>If the entries above appear empty, open the document in Word and press Ctrl+A then F9 to build the table of contents with page numbers and links.</w:t>
       </w:r>
     </w:p>
     <w:p>
@@ -3224,7 +3210,7 @@
           <w:i w:val="0"/>
           <w:sz w:val="22"/>
         </w:rPr>
-        <w:t>Taking the metric from outside the chain does work. Preconditioning with the observed Fisher information brings acceptance to 24.6%, against the theoretical optimum of 23.4 percent, and raises bulk ESS from 4.2 to 627, a factor of 148, for essentially no additional cost per iteration (4.6 seconds against 2.4 for the full multi-chain run).</w:t>
+        <w:t>Taking the metric from outside the chain does work. Preconditioning with the observed Fisher information brings acceptance to 24.6%, against the theoretical optimum of 23.4 percent, and raises bulk ESS from 4.2 to 627, a factor of 148, for essentially no additional cost per iteration (4.9 seconds against 7.3 for the full multi-chain run).</w:t>
       </w:r>
     </w:p>
     <w:p>
@@ -3502,7 +3488,7 @@
               <w:rPr>
                 <w:sz w:val="19"/>
               </w:rPr>
-              <w:t>4.2 +/- 0.4</w:t>
+              <w:t>4.7 +/- 0.2</w:t>
             </w:r>
           </w:p>
         </w:tc>
@@ -3518,7 +3504,7 @@
               <w:rPr>
                 <w:sz w:val="19"/>
               </w:rPr>
-              <w:t>137</w:t>
+              <w:t>129</w:t>
             </w:r>
           </w:p>
         </w:tc>
@@ -3600,7 +3586,7 @@
               <w:rPr>
                 <w:sz w:val="19"/>
               </w:rPr>
-              <w:t>15.3 +/- 0.6</w:t>
+              <w:t>18.1 +/- 0.9</w:t>
             </w:r>
           </w:p>
         </w:tc>
@@ -3616,7 +3602,7 @@
               <w:rPr>
                 <w:sz w:val="19"/>
               </w:rPr>
-              <w:t>2512</w:t>
+              <w:t>2300</w:t>
             </w:r>
           </w:p>
         </w:tc>
@@ -3698,7 +3684,7 @@
               <w:rPr>
                 <w:sz w:val="19"/>
               </w:rPr>
-              <w:t>73.5 +/- 2.3</w:t>
+              <w:t>82.5 +/- 7.5</w:t>
             </w:r>
           </w:p>
         </w:tc>
@@ -3714,7 +3700,7 @@
               <w:rPr>
                 <w:sz w:val="19"/>
               </w:rPr>
-              <w:t>224</w:t>
+              <w:t>200</w:t>
             </w:r>
           </w:p>
         </w:tc>
@@ -3774,7 +3760,7 @@
           <w:i w:val="0"/>
           <w:sz w:val="22"/>
         </w:rPr>
-        <w:t>The ranking by bulk ESS per second is Gibbs (2512), HMC (224), Preconditioned MH (137). Gibbs leads because each draw is exact and cheap; HMC produces nearly uncorrelated draws but pays for 15 gradient evaluations per iteration; preconditioned Metropolis is cheapest per iteration but still random-walks. The Monte Carlo standard errors tell the same story in the units that matter for reporting a posterior mean.</w:t>
+        <w:t>The ranking by bulk ESS per second is Gibbs (2300), HMC (200), Preconditioned MH (129). Gibbs leads because each draw is exact and cheap; HMC produces nearly uncorrelated draws but pays for 15 gradient evaluations per iteration; preconditioned Metropolis is cheapest per iteration but still random-walks. The Monte Carlo standard errors tell the same story in the units that matter for reporting a posterior mean.</w:t>
       </w:r>
     </w:p>
     <w:p>
@@ -3853,7 +3839,7 @@
           <w:i w:val="0"/>
           <w:sz w:val="22"/>
         </w:rPr>
-        <w:t>The same posterior was also sampled with emcee 3.1.6 [14], which implements the affine-invariant ensemble algorithm of Goodman and Weare [15]. It shares nothing with our methods: no conditional structure, no gradients and no proposal covariance, and it is written by others. Running 40 walkers for 12,000 steps and discarding 4,000 produced 320,000 draws in 38.2 seconds, with worst R-hat 1.0240 and minimum bulk ESS 1918. Its posterior means agree with Gibbs to within 0.00086.</w:t>
+        <w:t>The same posterior was also sampled with emcee 3.1.6 [14], which implements the affine-invariant ensemble algorithm of Goodman and Weare [15]. It shares nothing with our methods: no conditional structure, no gradients and no proposal covariance, and it is written by others. Running 40 walkers for 12,000 steps and discarding 4,000 produced 320,000 draws in 46.3 seconds, with worst R-hat 1.0224 and minimum bulk ESS 1885. Its posterior means agree with Gibbs to within 0.00112.</w:t>
       </w:r>
     </w:p>
     <w:p>
@@ -3881,7 +3867,7 @@
           <w:i w:val="0"/>
           <w:sz w:val="22"/>
         </w:rPr>
-        <w:t>One caveat: at R-hat 1.0240 the emcee run is itself slightly above the 1.01 threshold used for our own samplers. Ensemble samplers correlate their walkers by construction, so the split-chain diagnostic is conservative when applied to them, but the agreement it supports is correspondingly approximate and is quoted here to four decimal places rather than more.</w:t>
+        <w:t>One caveat: at R-hat 1.0224 the emcee run is itself slightly above the 1.01 threshold used for our own samplers. Ensemble samplers correlate their walkers by construction, so the split-chain diagnostic is conservative when applied to them, but the agreement it supports is correspondingly approximate and is quoted here to four decimal places rather than more.</w:t>
       </w:r>
     </w:p>
     <w:p>
@@ -3919,6 +3905,20 @@
           <w:sz w:val="22"/>
         </w:rPr>
         <w:t>Metropolis and HMC both require tuning; the Gibbs samplers do not. For HMC the step size epsilon and the number of leapfrog steps L are varied jointly, because they trade off against one another and neither is interpretable alone. Efficiency is reported as bulk ESS per gradient evaluation, which is the natural currency for a gradient method, alongside acceptance rate and R-hat.</w:t>
+      </w:r>
+    </w:p>
+    <w:p>
+      <w:pPr>
+        <w:keepNext w:val="0"/>
+        <w:spacing w:after="120"/>
+      </w:pPr>
+      <w:r>
+        <w:rPr>
+          <w:b w:val="0"/>
+          <w:i w:val="0"/>
+          <w:sz w:val="22"/>
+        </w:rPr>
+        <w:t>The grid runs differ from the main experiment in one respect that should be stated. They are warm started at the least-squares fit with small random perturbations, rather than from the overdispersed points used in Section 5.2. Short runs from dispersed starts would spend most of their length travelling to the posterior, so the resulting diagnostics would measure burn-in rather than the effect of the tuning parameters, which is what the grid is meant to isolate. The cost of that choice is that split R-hat is a weaker guarantee here than in Table 4, because chains that begin close together can agree without having explored the posterior. The grid should therefore be read as ranking configurations against one another, not as certifying any of them as converged.</w:t>
       </w:r>
     </w:p>
     <w:p>
@@ -6620,7 +6620,7 @@
               <w:rPr>
                 <w:sz w:val="19"/>
               </w:rPr>
-              <w:t>1.6303</w:t>
+              <w:t>1.6305</w:t>
             </w:r>
           </w:p>
         </w:tc>
@@ -6636,7 +6636,7 @@
               <w:rPr>
                 <w:sz w:val="19"/>
               </w:rPr>
-              <w:t>75.0%</w:t>
+              <w:t>74.9%</w:t>
             </w:r>
           </w:p>
         </w:tc>
@@ -6652,7 +6652,7 @@
               <w:rPr>
                 <w:sz w:val="19"/>
               </w:rPr>
-              <w:t>97.8%</w:t>
+              <w:t>97.7%</w:t>
             </w:r>
           </w:p>
         </w:tc>
@@ -6668,7 +6668,7 @@
               <w:rPr>
                 <w:sz w:val="19"/>
               </w:rPr>
-              <w:t>0.0144</w:t>
+              <w:t>0.0143</w:t>
             </w:r>
           </w:p>
         </w:tc>
@@ -6702,7 +6702,7 @@
               <w:rPr>
                 <w:sz w:val="19"/>
               </w:rPr>
-              <w:t>1.6157</w:t>
+              <w:t>1.6158</w:t>
             </w:r>
           </w:p>
         </w:tc>
@@ -6784,7 +6784,7 @@
               <w:rPr>
                 <w:sz w:val="19"/>
               </w:rPr>
-              <w:t>1.5897</w:t>
+              <w:t>1.5898</w:t>
             </w:r>
           </w:p>
         </w:tc>
@@ -7190,6 +7190,20 @@
     </w:p>
     <w:p>
       <w:pPr>
+        <w:keepNext w:val="0"/>
+        <w:spacing w:after="120"/>
+      </w:pPr>
+      <w:r>
+        <w:rPr>
+          <w:b w:val="0"/>
+          <w:i w:val="0"/>
+          <w:sz w:val="22"/>
+        </w:rPr>
+        <w:t>The Student-t model is held to the same standard as the samplers in Section 5. It is fitted with 4 chains from overdispersed starting points and diagnosed with the same estimators and the same worst-case aggregation, giving R-hat 1.0012 and minimum bulk ESS 2272, which meets the criterion of R-hat below 1.01 and bulk ESS at least 400 used throughout. Every Student-t number reported in this section comes from those 4 chains pooled, not from a single run. This matters because the argument of Section 5 is that a sampler which has not been diagnosed cannot support conclusions, and that argument applies to the model used for the predictive results just as much as to the ones being compared.</w:t>
+      </w:r>
+    </w:p>
+    <w:p>
+      <w:pPr>
         <w:keepNext/>
         <w:spacing w:after="60"/>
       </w:pPr>
@@ -7532,7 +7546,7 @@
               <w:rPr>
                 <w:sz w:val="19"/>
               </w:rPr>
-              <w:t>0.0144</w:t>
+              <w:t>0.0145</w:t>
             </w:r>
           </w:p>
         </w:tc>
@@ -7897,7 +7911,7 @@
               <w:rPr>
                 <w:sz w:val="19"/>
               </w:rPr>
-              <w:t>74.6%</w:t>
+              <w:t>74.1%</w:t>
             </w:r>
           </w:p>
         </w:tc>
@@ -7913,7 +7927,7 @@
               <w:rPr>
                 <w:sz w:val="19"/>
               </w:rPr>
-              <w:t>[70.0%, 79.3%]</w:t>
+              <w:t>[69.6%, 79.0%]</w:t>
             </w:r>
           </w:p>
         </w:tc>
@@ -8059,7 +8073,7 @@
               <w:rPr>
                 <w:sz w:val="19"/>
               </w:rPr>
-              <w:t>1.74</w:t>
+              <w:t>1.75</w:t>
             </w:r>
           </w:p>
         </w:tc>
@@ -8103,7 +8117,7 @@
           <w:i w:val="0"/>
           <w:sz w:val="22"/>
         </w:rPr>
-        <w:t>The Student-t likelihood improves calibration substantially but does not fix it. Coverage of the nominal 50 percent interval falls from 94.7% to 74.6% and the mean width from 2.36 to 0.33 percentage points, yet 74.6% against a nominal 50 percent is still severely miscalibrated: the intervals remain about 1.5 times wider than they should be. This is a partial improvement, not a repair, and the residual miscalibration is consistent with the diagnostics of Section 6.4: a Student-t with a single scale still assumes one noise level for every machine and every time, whereas the data are heteroscedastic across machines, as Section 3.5 showed, and serially dependent.</w:t>
+        <w:t>The Student-t likelihood improves calibration substantially but does not fix it. Coverage of the nominal 50 percent interval falls from 94.7% to 74.1% and the mean width from 2.36 to 0.33 percentage points, yet 74.1% against a nominal 50 percent is still severely miscalibrated: the intervals remain about 1.5 times wider than they should be. This is a partial improvement, not a repair, and the residual miscalibration is consistent with the diagnostics of Section 6.4: a Student-t with a single scale still assumes one noise level for every machine and every time, whereas the data are heteroscedastic across machines, as Section 3.5 showed, and serially dependent.</w:t>
       </w:r>
     </w:p>
     <w:p>
@@ -8290,7 +8304,7 @@
           <w:i w:val="0"/>
           <w:sz w:val="22"/>
         </w:rPr>
-        <w:t>RQ3. The intervals are not calibrated. A Gaussian likelihood produces nominal 50 percent intervals covering 94.7%, because heavy-tailed residuals inflate the single noise parameter. A Student-t likelihood selected on validation data reduces this to 74.6%, a substantial but partial improvement.</w:t>
+        <w:t>RQ3. The intervals are not calibrated. A Gaussian likelihood produces nominal 50 percent intervals covering 94.7%, because heavy-tailed residuals inflate the single noise parameter. A Student-t likelihood selected on validation data reduces this to 74.1%, a substantial but partial improvement.</w:t>
       </w:r>
     </w:p>
     <w:p>
@@ -8462,7 +8476,7 @@
         <w:ind w:left="720"/>
       </w:pPr>
       <w:r>
-        <w:t>Posterior predictive intervals from a Gaussian likelihood are badly miscalibrated, a nominal 50 percent interval covering 94.7%, because test residuals have excess kurtosis 111. A Student-t likelihood chosen on validation data improves this to 74.6% and reduces the median absolute error from 0.210 to 0.072 percentage points, but the intervals remain substantially wider than nominal.</w:t>
+        <w:t>Posterior predictive intervals from a Gaussian likelihood are badly miscalibrated, a nominal 50 percent interval covering 94.7%, because test residuals have excess kurtosis 111. A Student-t likelihood chosen on validation data improves this to 74.1% and reduces the median absolute error from 0.210 to 0.072 percentage points, but the intervals remain substantially wider than nominal.</w:t>
       </w:r>
     </w:p>
     <w:p>

</xml_diff>